<commit_message>
nav completed, hero started
</commit_message>
<xml_diff>
--- a/LearningDiary/SDS_learning_diary_Miro_Kymäläinen.docx
+++ b/LearningDiary/SDS_learning_diary_Miro_Kymäläinen.docx
@@ -333,14 +333,12 @@
           <w:lang w:val="en-US"/>
         </w:rPr>
       </w:pPr>
-      <w:proofErr w:type="gramStart"/>
-      <w:r>
-        <w:rPr>
-          <w:lang w:val="en-US"/>
-        </w:rPr>
-        <w:t>Date :</w:t>
-      </w:r>
-      <w:proofErr w:type="gramEnd"/>
+      <w:r>
+        <w:rPr>
+          <w:lang w:val="en-US"/>
+        </w:rPr>
+        <w:t>Date:</w:t>
+      </w:r>
       <w:r>
         <w:rPr>
           <w:lang w:val="en-US"/>
@@ -360,115 +358,178 @@
           <w:lang w:val="en-US"/>
         </w:rPr>
       </w:pPr>
-      <w:proofErr w:type="gramStart"/>
-      <w:r>
-        <w:rPr>
-          <w:lang w:val="en-US"/>
-        </w:rPr>
-        <w:t>Activity :</w:t>
-      </w:r>
-      <w:proofErr w:type="gramEnd"/>
-      <w:r>
-        <w:rPr>
-          <w:lang w:val="en-US"/>
-        </w:rPr>
-        <w:t xml:space="preserve"> Video lecture or other activity details here</w:t>
-      </w:r>
-    </w:p>
-    <w:p>
-      <w:pPr>
-        <w:rPr>
-          <w:lang w:val="en-US"/>
-        </w:rPr>
-      </w:pPr>
-      <w:r>
-        <w:rPr>
-          <w:lang w:val="en-US"/>
-        </w:rPr>
-        <w:t>Learning outcome: what did I learn</w:t>
-      </w:r>
-    </w:p>
-    <w:p>
-      <w:pPr>
-        <w:rPr>
-          <w:lang w:val="en-US"/>
-        </w:rPr>
-      </w:pPr>
-    </w:p>
-    <w:p>
-      <w:pPr>
-        <w:rPr>
-          <w:lang w:val="en-US"/>
-        </w:rPr>
-      </w:pPr>
-    </w:p>
-    <w:p>
-      <w:pPr>
-        <w:rPr>
-          <w:lang w:val="en-US"/>
-        </w:rPr>
-      </w:pPr>
-      <w:proofErr w:type="gramStart"/>
-      <w:r>
-        <w:rPr>
-          <w:lang w:val="en-US"/>
-        </w:rPr>
-        <w:t>Date :</w:t>
-      </w:r>
-      <w:proofErr w:type="gramEnd"/>
+      <w:r>
+        <w:rPr>
+          <w:lang w:val="en-US"/>
+        </w:rPr>
+        <w:t>Activity:</w:t>
+      </w:r>
       <w:r>
         <w:rPr>
           <w:lang w:val="en-US"/>
         </w:rPr>
         <w:t xml:space="preserve"> </w:t>
       </w:r>
-      <w:proofErr w:type="gramStart"/>
-      <w:r>
-        <w:rPr>
-          <w:lang w:val="en-US"/>
-        </w:rPr>
-        <w:t>( date</w:t>
-      </w:r>
-      <w:proofErr w:type="gramEnd"/>
-      <w:r>
-        <w:rPr>
-          <w:lang w:val="en-US"/>
-        </w:rPr>
-        <w:t xml:space="preserve"> here)</w:t>
-      </w:r>
-    </w:p>
-    <w:p>
-      <w:pPr>
-        <w:rPr>
-          <w:lang w:val="en-US"/>
-        </w:rPr>
-      </w:pPr>
-      <w:proofErr w:type="gramStart"/>
-      <w:r>
-        <w:rPr>
-          <w:lang w:val="en-US"/>
-        </w:rPr>
-        <w:t>Activity :</w:t>
-      </w:r>
-      <w:proofErr w:type="gramEnd"/>
-      <w:r>
-        <w:rPr>
-          <w:lang w:val="en-US"/>
-        </w:rPr>
-        <w:t xml:space="preserve"> Video lecture or other activity details here</w:t>
-      </w:r>
-    </w:p>
-    <w:p>
-      <w:pPr>
-        <w:rPr>
-          <w:lang w:val="en-US"/>
-        </w:rPr>
-      </w:pPr>
-      <w:r>
-        <w:rPr>
-          <w:lang w:val="en-US"/>
-        </w:rPr>
-        <w:t>Learning outcome: what did I learn</w:t>
+      <w:r>
+        <w:rPr>
+          <w:lang w:val="en-US"/>
+        </w:rPr>
+        <w:t>Environment setup, course overview.</w:t>
+      </w:r>
+    </w:p>
+    <w:p>
+      <w:pPr>
+        <w:rPr>
+          <w:lang w:val="en-US"/>
+        </w:rPr>
+      </w:pPr>
+      <w:r>
+        <w:rPr>
+          <w:lang w:val="en-US"/>
+        </w:rPr>
+        <w:t>Learning outcome:</w:t>
+      </w:r>
+    </w:p>
+    <w:p>
+      <w:pPr>
+        <w:rPr>
+          <w:lang w:val="en-US"/>
+        </w:rPr>
+      </w:pPr>
+    </w:p>
+    <w:p>
+      <w:pPr>
+        <w:rPr>
+          <w:lang w:val="en-US"/>
+        </w:rPr>
+      </w:pPr>
+      <w:r>
+        <w:rPr>
+          <w:lang w:val="en-US"/>
+        </w:rPr>
+        <w:t>Date: 20.05.2026</w:t>
+      </w:r>
+    </w:p>
+    <w:p>
+      <w:pPr>
+        <w:rPr>
+          <w:lang w:val="en-US"/>
+        </w:rPr>
+      </w:pPr>
+      <w:r>
+        <w:rPr>
+          <w:lang w:val="en-US"/>
+        </w:rPr>
+        <w:t xml:space="preserve">Activity: </w:t>
+      </w:r>
+      <w:r>
+        <w:rPr>
+          <w:lang w:val="en-US"/>
+        </w:rPr>
+        <w:t>Overviewing the coursework video.</w:t>
+      </w:r>
+    </w:p>
+    <w:p>
+      <w:pPr>
+        <w:rPr>
+          <w:lang w:val="en-US"/>
+        </w:rPr>
+      </w:pPr>
+      <w:r>
+        <w:rPr>
+          <w:lang w:val="en-US"/>
+        </w:rPr>
+        <w:t xml:space="preserve">Learning outcome: </w:t>
+      </w:r>
+      <w:r>
+        <w:rPr>
+          <w:lang w:val="en-US"/>
+        </w:rPr>
+        <w:t xml:space="preserve">Clear plan for completing the </w:t>
+      </w:r>
+      <w:proofErr w:type="spellStart"/>
+      <w:r>
+        <w:rPr>
+          <w:lang w:val="en-US"/>
+        </w:rPr>
+        <w:t>courswrok</w:t>
+      </w:r>
+      <w:proofErr w:type="spellEnd"/>
+      <w:r>
+        <w:rPr>
+          <w:lang w:val="en-US"/>
+        </w:rPr>
+        <w:t>.</w:t>
+      </w:r>
+    </w:p>
+    <w:p>
+      <w:pPr>
+        <w:rPr>
+          <w:lang w:val="en-US"/>
+        </w:rPr>
+      </w:pPr>
+    </w:p>
+    <w:p>
+      <w:pPr>
+        <w:rPr>
+          <w:lang w:val="en-US"/>
+        </w:rPr>
+      </w:pPr>
+      <w:r>
+        <w:rPr>
+          <w:lang w:val="en-US"/>
+        </w:rPr>
+        <w:t>Date:</w:t>
+      </w:r>
+      <w:r>
+        <w:rPr>
+          <w:lang w:val="en-US"/>
+        </w:rPr>
+        <w:t xml:space="preserve"> </w:t>
+      </w:r>
+      <w:r>
+        <w:rPr>
+          <w:lang w:val="en-US"/>
+        </w:rPr>
+        <w:t>24.05.2026</w:t>
+      </w:r>
+    </w:p>
+    <w:p>
+      <w:pPr>
+        <w:rPr>
+          <w:lang w:val="en-US"/>
+        </w:rPr>
+      </w:pPr>
+      <w:r>
+        <w:rPr>
+          <w:lang w:val="en-US"/>
+        </w:rPr>
+        <w:t>Activity:</w:t>
+      </w:r>
+      <w:r>
+        <w:rPr>
+          <w:lang w:val="en-US"/>
+        </w:rPr>
+        <w:t xml:space="preserve"> </w:t>
+      </w:r>
+      <w:r>
+        <w:rPr>
+          <w:lang w:val="en-US"/>
+        </w:rPr>
+        <w:t>Structuring project.</w:t>
+      </w:r>
+    </w:p>
+    <w:p>
+      <w:pPr>
+        <w:rPr>
+          <w:lang w:val="en-US"/>
+        </w:rPr>
+      </w:pPr>
+      <w:r>
+        <w:rPr>
+          <w:lang w:val="en-US"/>
+        </w:rPr>
+        <w:t xml:space="preserve">Learning outcome: </w:t>
       </w:r>
     </w:p>
     <w:p>
@@ -661,27 +722,99 @@
         <w:rPr>
           <w:lang w:val="en-US"/>
         </w:rPr>
-        <w:t xml:space="preserve"> I have existing </w:t>
+        <w:t xml:space="preserve"> I have existing Github account so decided to use that</w:t>
+      </w:r>
+      <w:r>
+        <w:rPr>
+          <w:lang w:val="en-US"/>
+        </w:rPr>
+        <w:t xml:space="preserve"> instead of Bitbucket</w:t>
+      </w:r>
+      <w:r>
+        <w:rPr>
+          <w:lang w:val="en-US"/>
+        </w:rPr>
+        <w:t xml:space="preserve">. Created the project but didn’t commit </w:t>
+      </w:r>
+      <w:r>
+        <w:rPr>
+          <w:lang w:val="en-US"/>
+        </w:rPr>
+        <w:t>anything</w:t>
+      </w:r>
+      <w:r>
+        <w:rPr>
+          <w:lang w:val="en-US"/>
+        </w:rPr>
+        <w:t xml:space="preserve"> yet.</w:t>
+      </w:r>
+    </w:p>
+    <w:p>
+      <w:pPr>
+        <w:pStyle w:val="BodyText"/>
+        <w:rPr>
+          <w:lang w:val="en-US"/>
+        </w:rPr>
+      </w:pPr>
+    </w:p>
+    <w:p>
+      <w:pPr>
+        <w:pStyle w:val="BodyText"/>
+        <w:rPr>
+          <w:lang w:val="en-US"/>
+        </w:rPr>
+      </w:pPr>
+      <w:r>
+        <w:rPr>
+          <w:lang w:val="en-US"/>
+        </w:rPr>
+        <w:t>2</w:t>
+      </w:r>
+      <w:r>
+        <w:rPr>
+          <w:lang w:val="en-US"/>
+        </w:rPr>
+        <w:t>0.</w:t>
+      </w:r>
+      <w:r>
+        <w:rPr>
+          <w:lang w:val="en-US"/>
+        </w:rPr>
+        <w:t>05.2026</w:t>
+      </w:r>
+    </w:p>
+    <w:p>
+      <w:pPr>
+        <w:pStyle w:val="BodyText"/>
+        <w:rPr>
+          <w:lang w:val="en-US"/>
+        </w:rPr>
+      </w:pPr>
+      <w:r>
+        <w:rPr>
+          <w:lang w:val="en-US"/>
+        </w:rPr>
+        <w:t>I viewed the coursework video. Now I have clear visio what to do. I also looked at the Figma and downloaded necessary image materials</w:t>
+      </w:r>
+      <w:r>
+        <w:rPr>
+          <w:lang w:val="en-US"/>
+        </w:rPr>
+        <w:t xml:space="preserve"> from </w:t>
       </w:r>
       <w:proofErr w:type="spellStart"/>
       <w:r>
         <w:rPr>
           <w:lang w:val="en-US"/>
         </w:rPr>
-        <w:t>Github</w:t>
+        <w:t>github</w:t>
       </w:r>
       <w:proofErr w:type="spellEnd"/>
       <w:r>
         <w:rPr>
           <w:lang w:val="en-US"/>
         </w:rPr>
-        <w:t xml:space="preserve"> account so decided to use that</w:t>
-      </w:r>
-      <w:r>
-        <w:rPr>
-          <w:lang w:val="en-US"/>
-        </w:rPr>
-        <w:t>. Created the project but didn’t commit it yet.</w:t>
+        <w:t>.</w:t>
       </w:r>
     </w:p>
     <w:p>
@@ -699,6 +832,150 @@
           <w:lang w:val="en-US"/>
         </w:rPr>
       </w:pPr>
+      <w:r>
+        <w:rPr>
+          <w:lang w:val="en-US"/>
+        </w:rPr>
+        <w:t>24.05.2026</w:t>
+      </w:r>
+      <w:r>
+        <w:rPr>
+          <w:lang w:val="en-US"/>
+        </w:rPr>
+        <w:br/>
+      </w:r>
+      <w:r>
+        <w:rPr>
+          <w:lang w:val="en-US"/>
+        </w:rPr>
+        <w:t xml:space="preserve">Created better project structure according to course instructions. </w:t>
+      </w:r>
+      <w:r>
+        <w:rPr>
+          <w:lang w:val="en-US"/>
+        </w:rPr>
+        <w:t xml:space="preserve">Also published the first version. </w:t>
+      </w:r>
+      <w:r>
+        <w:rPr>
+          <w:lang w:val="en-US"/>
+        </w:rPr>
+        <w:t>Created README and VideoLink files so the structure is now complete.</w:t>
+      </w:r>
+      <w:r>
+        <w:rPr>
+          <w:lang w:val="en-US"/>
+        </w:rPr>
+        <w:t xml:space="preserve"> I started building the structure and links like shown on the video. </w:t>
+      </w:r>
+      <w:r>
+        <w:rPr>
+          <w:lang w:val="en-US"/>
+        </w:rPr>
+        <w:t xml:space="preserve">Created also files inside “Coursework” folder and connected </w:t>
+      </w:r>
+      <w:proofErr w:type="spellStart"/>
+      <w:r>
+        <w:rPr>
+          <w:lang w:val="en-US"/>
+        </w:rPr>
+        <w:t>css</w:t>
+      </w:r>
+      <w:proofErr w:type="spellEnd"/>
+      <w:r>
+        <w:rPr>
+          <w:lang w:val="en-US"/>
+        </w:rPr>
+        <w:t xml:space="preserve"> with html file. </w:t>
+      </w:r>
+      <w:r>
+        <w:rPr>
+          <w:lang w:val="en-US"/>
+        </w:rPr>
+        <w:t>For previewing the project while building I use VS code Live Server plugin</w:t>
+      </w:r>
+      <w:r>
+        <w:rPr>
+          <w:lang w:val="en-US"/>
+        </w:rPr>
+        <w:t>, which I already have installed,</w:t>
+      </w:r>
+      <w:r>
+        <w:rPr>
+          <w:lang w:val="en-US"/>
+        </w:rPr>
+        <w:t xml:space="preserve"> so I don’t need to continuously refresh the page. </w:t>
+      </w:r>
+      <w:r>
+        <w:rPr>
+          <w:lang w:val="en-US"/>
+        </w:rPr>
+        <w:t xml:space="preserve">Setting </w:t>
+      </w:r>
+      <w:r>
+        <w:rPr>
+          <w:lang w:val="en-US"/>
+        </w:rPr>
+        <w:t>favicon</w:t>
+      </w:r>
+      <w:r>
+        <w:rPr>
+          <w:lang w:val="en-US"/>
+        </w:rPr>
+        <w:t xml:space="preserve"> in plain html was new for me.</w:t>
+      </w:r>
+      <w:r>
+        <w:rPr>
+          <w:lang w:val="en-US"/>
+        </w:rPr>
+        <w:t xml:space="preserve"> Regarding CSS the setup looks </w:t>
+      </w:r>
+      <w:r>
+        <w:rPr>
+          <w:lang w:val="en-US"/>
+        </w:rPr>
+        <w:t xml:space="preserve">quite basic. I’m already familiar for instance, with border-box. For fonts instead of </w:t>
+      </w:r>
+      <w:proofErr w:type="spellStart"/>
+      <w:r>
+        <w:rPr>
+          <w:lang w:val="en-US"/>
+        </w:rPr>
+        <w:t>px</w:t>
+      </w:r>
+      <w:proofErr w:type="spellEnd"/>
+      <w:r>
+        <w:rPr>
+          <w:lang w:val="en-US"/>
+        </w:rPr>
+        <w:t xml:space="preserve"> I prefer using rems.</w:t>
+      </w:r>
+      <w:r>
+        <w:rPr>
+          <w:lang w:val="en-US"/>
+        </w:rPr>
+        <w:t xml:space="preserve"> </w:t>
+      </w:r>
+      <w:proofErr w:type="spellStart"/>
+      <w:r>
+        <w:rPr>
+          <w:lang w:val="en-US"/>
+        </w:rPr>
+        <w:t>Css</w:t>
+      </w:r>
+      <w:proofErr w:type="spellEnd"/>
+      <w:r>
+        <w:rPr>
+          <w:lang w:val="en-US"/>
+        </w:rPr>
+        <w:t xml:space="preserve"> variables are smart thing to do as we are going to use the same colors many times. </w:t>
+      </w:r>
+      <w:r>
+        <w:rPr>
+          <w:lang w:val="en-US"/>
+        </w:rPr>
+        <w:t>This could be also done with class, for each color we would have class with background color for instance.</w:t>
+      </w:r>
     </w:p>
     <w:p>
       <w:pPr>
@@ -719,88 +996,7 @@
         <w:rPr>
           <w:lang w:val="en-US"/>
         </w:rPr>
-        <w:t>11.9.201</w:t>
-      </w:r>
-      <w:r>
-        <w:rPr>
-          <w:lang w:val="en-US"/>
-        </w:rPr>
-        <w:t>8</w:t>
-      </w:r>
-    </w:p>
-    <w:p>
-      <w:pPr>
-        <w:pStyle w:val="BodyText"/>
-        <w:rPr>
-          <w:lang w:val="en-US"/>
-        </w:rPr>
-      </w:pPr>
-      <w:r>
-        <w:rPr>
-          <w:lang w:val="en-US"/>
-        </w:rPr>
-        <w:br/>
-        <w:t xml:space="preserve">I have chosen VS Code as my code editor for this course, I learned how to set up addons by googling how to do it. I searched the web for best addons and chose the best addons that I think fits me best.  </w:t>
-      </w:r>
-      <w:r>
-        <w:rPr>
-          <w:lang w:val="en-US"/>
-        </w:rPr>
-        <w:t>I started to watch the first part of the example project to understand the technologies better.</w:t>
-      </w:r>
-    </w:p>
-    <w:p>
-      <w:pPr>
-        <w:pStyle w:val="BodyText"/>
-        <w:rPr>
-          <w:lang w:val="en-US"/>
-        </w:rPr>
-      </w:pPr>
-    </w:p>
-    <w:p>
-      <w:pPr>
-        <w:pStyle w:val="BodyText"/>
-        <w:rPr>
-          <w:lang w:val="en-US"/>
-        </w:rPr>
-      </w:pPr>
-      <w:r>
-        <w:rPr>
-          <w:lang w:val="en-US"/>
-        </w:rPr>
-        <w:t xml:space="preserve">I did my </w:t>
-      </w:r>
-      <w:r>
-        <w:rPr>
-          <w:lang w:val="en-US"/>
-        </w:rPr>
-        <w:t xml:space="preserve">second </w:t>
-      </w:r>
-      <w:r>
-        <w:rPr>
-          <w:lang w:val="en-US"/>
-        </w:rPr>
-        <w:t>commit but somehow it did not go as</w:t>
-      </w:r>
-      <w:r>
-        <w:rPr>
-          <w:lang w:val="en-US"/>
-        </w:rPr>
-        <w:t xml:space="preserve"> I planned. I went to </w:t>
-      </w:r>
-      <w:proofErr w:type="spellStart"/>
-      <w:r>
-        <w:rPr>
-          <w:lang w:val="en-US"/>
-        </w:rPr>
-        <w:t>stackoverflow</w:t>
-      </w:r>
-      <w:proofErr w:type="spellEnd"/>
-      <w:r>
-        <w:rPr>
-          <w:lang w:val="en-US"/>
-        </w:rPr>
-        <w:t xml:space="preserve"> and found quite many threads about version control problems. I was able to figure out what was the problem and continued to watch the first part till the end.</w:t>
+        <w:t>I have usually used lucid icons or similar, but the font-awesome icons are handy too. Of course, it takes time to learn them.</w:t>
       </w:r>
     </w:p>
     <w:p>

</xml_diff>

<commit_message>
finalised html and css for faq
</commit_message>
<xml_diff>
--- a/LearningDiary/SDS_learning_diary_Miro_Kymäläinen.docx
+++ b/LearningDiary/SDS_learning_diary_Miro_Kymäläinen.docx
@@ -14,7 +14,6 @@
           <w:lang w:val="en-US"/>
         </w:rPr>
       </w:pPr>
-      <w:proofErr w:type="spellStart"/>
       <w:r>
         <w:rPr>
           <w:rFonts w:ascii="Times New Roman" w:hAnsi="Times New Roman" w:cs="Times New Roman"/>
@@ -23,53 +22,8 @@
           <w:szCs w:val="24"/>
           <w:lang w:val="en-US"/>
         </w:rPr>
-        <w:t>Lappeenrannan</w:t>
-      </w:r>
-      <w:proofErr w:type="spellEnd"/>
-      <w:r>
-        <w:rPr>
-          <w:rFonts w:ascii="Times New Roman" w:hAnsi="Times New Roman" w:cs="Times New Roman"/>
-          <w:b w:val="0"/>
-          <w:sz w:val="24"/>
-          <w:szCs w:val="24"/>
-          <w:lang w:val="en-US"/>
-        </w:rPr>
-        <w:t xml:space="preserve"> </w:t>
-      </w:r>
-      <w:proofErr w:type="spellStart"/>
-      <w:r>
-        <w:rPr>
-          <w:rFonts w:ascii="Times New Roman" w:hAnsi="Times New Roman" w:cs="Times New Roman"/>
-          <w:b w:val="0"/>
-          <w:sz w:val="24"/>
-          <w:szCs w:val="24"/>
-          <w:lang w:val="en-US"/>
-        </w:rPr>
-        <w:t>teknillinen</w:t>
-      </w:r>
-      <w:proofErr w:type="spellEnd"/>
-      <w:r>
-        <w:rPr>
-          <w:rFonts w:ascii="Times New Roman" w:hAnsi="Times New Roman" w:cs="Times New Roman"/>
-          <w:b w:val="0"/>
-          <w:sz w:val="24"/>
-          <w:szCs w:val="24"/>
-          <w:lang w:val="en-US"/>
-        </w:rPr>
-        <w:t xml:space="preserve"> </w:t>
-      </w:r>
-      <w:proofErr w:type="spellStart"/>
-      <w:r>
-        <w:rPr>
-          <w:rFonts w:ascii="Times New Roman" w:hAnsi="Times New Roman" w:cs="Times New Roman"/>
-          <w:b w:val="0"/>
-          <w:sz w:val="24"/>
-          <w:szCs w:val="24"/>
-          <w:lang w:val="en-US"/>
-        </w:rPr>
-        <w:t>yliopisto</w:t>
-      </w:r>
-      <w:proofErr w:type="spellEnd"/>
+        <w:t>Lappeenrannan teknillinen yliopisto</w:t>
+      </w:r>
     </w:p>
     <w:p>
       <w:pPr>
@@ -817,21 +771,7 @@
         <w:rPr>
           <w:lang w:val="en-US"/>
         </w:rPr>
-        <w:t xml:space="preserve">Created also files inside “Coursework” folder and connected </w:t>
-      </w:r>
-      <w:proofErr w:type="spellStart"/>
-      <w:r>
-        <w:rPr>
-          <w:lang w:val="en-US"/>
-        </w:rPr>
-        <w:t>css</w:t>
-      </w:r>
-      <w:proofErr w:type="spellEnd"/>
-      <w:r>
-        <w:rPr>
-          <w:lang w:val="en-US"/>
-        </w:rPr>
-        <w:t xml:space="preserve"> with html file. </w:t>
+        <w:t xml:space="preserve">Created also files inside “Coursework” folder and connected css with html file. </w:t>
       </w:r>
       <w:r>
         <w:rPr>
@@ -977,35 +917,7 @@
         <w:rPr>
           <w:lang w:val="en-US"/>
         </w:rPr>
-        <w:t xml:space="preserve">Creating the card p styles is a bit over engineered, I think. Instead of using </w:t>
-      </w:r>
-      <w:proofErr w:type="gramStart"/>
-      <w:r>
-        <w:rPr>
-          <w:lang w:val="en-US"/>
-        </w:rPr>
-        <w:t>nth-child</w:t>
-      </w:r>
-      <w:proofErr w:type="gramEnd"/>
-      <w:r>
-        <w:rPr>
-          <w:lang w:val="en-US"/>
-        </w:rPr>
-        <w:t xml:space="preserve"> we could just easily give classes for each as the structure is always the same. Maybe the point here is just to thought how those selectors work. I would use the </w:t>
-      </w:r>
-      <w:proofErr w:type="gramStart"/>
-      <w:r>
-        <w:rPr>
-          <w:lang w:val="en-US"/>
-        </w:rPr>
-        <w:t>nth-child</w:t>
-      </w:r>
-      <w:proofErr w:type="gramEnd"/>
-      <w:r>
-        <w:rPr>
-          <w:lang w:val="en-US"/>
-        </w:rPr>
-        <w:t xml:space="preserve"> if I have a list of </w:t>
+        <w:t xml:space="preserve">Creating the card p styles is a bit over engineered, I think. Instead of using nth-child we could just easily give classes for each as the structure is always the same. Maybe the point here is just to thought how those selectors work. I would use the nth-child if I have a list of </w:t>
       </w:r>
       <w:r>
         <w:rPr>
@@ -1040,7 +952,65 @@
         <w:rPr>
           <w:lang w:val="en-US"/>
         </w:rPr>
-        <w:t xml:space="preserve">Also made the same mistake when creating cards as on the video. CSS file is read from top to bottom. </w:t>
+        <w:t xml:space="preserve">Also made the same mistake </w:t>
+      </w:r>
+      <w:r>
+        <w:rPr>
+          <w:lang w:val="en-US"/>
+        </w:rPr>
+        <w:t xml:space="preserve">regarding background </w:t>
+      </w:r>
+      <w:r>
+        <w:rPr>
+          <w:lang w:val="en-US"/>
+        </w:rPr>
+        <w:t xml:space="preserve">when creating </w:t>
+      </w:r>
+      <w:r>
+        <w:rPr>
+          <w:lang w:val="en-US"/>
+        </w:rPr>
+        <w:t xml:space="preserve">pricing </w:t>
+      </w:r>
+      <w:r>
+        <w:rPr>
+          <w:lang w:val="en-US"/>
+        </w:rPr>
+        <w:t>cards</w:t>
+      </w:r>
+      <w:r>
+        <w:rPr>
+          <w:lang w:val="en-US"/>
+        </w:rPr>
+        <w:t xml:space="preserve"> (at 01:07) </w:t>
+      </w:r>
+      <w:r>
+        <w:rPr>
+          <w:lang w:val="en-US"/>
+        </w:rPr>
+        <w:t xml:space="preserve"> as on the video. CSS file is read from top to bottom. </w:t>
+      </w:r>
+    </w:p>
+    <w:p>
+      <w:pPr>
+        <w:pStyle w:val="BodyText"/>
+        <w:rPr>
+          <w:lang w:val="en-US"/>
+        </w:rPr>
+      </w:pPr>
+    </w:p>
+    <w:p>
+      <w:pPr>
+        <w:pStyle w:val="BodyText"/>
+        <w:rPr>
+          <w:lang w:val="en-US"/>
+        </w:rPr>
+      </w:pPr>
+      <w:r>
+        <w:rPr>
+          <w:lang w:val="en-US"/>
+        </w:rPr>
+        <w:t>Pricing section finalized. I maybe missed something on the video as at the end I had the pricing cards aligned little bit different. I added for the pricing grid align-items center and that fixed the issue.</w:t>
       </w:r>
     </w:p>
     <w:p>

</xml_diff>

<commit_message>
completed faqs and javascript
</commit_message>
<xml_diff>
--- a/LearningDiary/SDS_learning_diary_Miro_Kymäläinen.docx
+++ b/LearningDiary/SDS_learning_diary_Miro_Kymäläinen.docx
@@ -14,6 +14,7 @@
           <w:lang w:val="en-US"/>
         </w:rPr>
       </w:pPr>
+      <w:proofErr w:type="spellStart"/>
       <w:r>
         <w:rPr>
           <w:rFonts w:ascii="Times New Roman" w:hAnsi="Times New Roman" w:cs="Times New Roman"/>
@@ -22,8 +23,53 @@
           <w:szCs w:val="24"/>
           <w:lang w:val="en-US"/>
         </w:rPr>
-        <w:t>Lappeenrannan teknillinen yliopisto</w:t>
-      </w:r>
+        <w:t>Lappeenrannan</w:t>
+      </w:r>
+      <w:proofErr w:type="spellEnd"/>
+      <w:r>
+        <w:rPr>
+          <w:rFonts w:ascii="Times New Roman" w:hAnsi="Times New Roman" w:cs="Times New Roman"/>
+          <w:b w:val="0"/>
+          <w:sz w:val="24"/>
+          <w:szCs w:val="24"/>
+          <w:lang w:val="en-US"/>
+        </w:rPr>
+        <w:t xml:space="preserve"> </w:t>
+      </w:r>
+      <w:proofErr w:type="spellStart"/>
+      <w:r>
+        <w:rPr>
+          <w:rFonts w:ascii="Times New Roman" w:hAnsi="Times New Roman" w:cs="Times New Roman"/>
+          <w:b w:val="0"/>
+          <w:sz w:val="24"/>
+          <w:szCs w:val="24"/>
+          <w:lang w:val="en-US"/>
+        </w:rPr>
+        <w:t>teknillinen</w:t>
+      </w:r>
+      <w:proofErr w:type="spellEnd"/>
+      <w:r>
+        <w:rPr>
+          <w:rFonts w:ascii="Times New Roman" w:hAnsi="Times New Roman" w:cs="Times New Roman"/>
+          <w:b w:val="0"/>
+          <w:sz w:val="24"/>
+          <w:szCs w:val="24"/>
+          <w:lang w:val="en-US"/>
+        </w:rPr>
+        <w:t xml:space="preserve"> </w:t>
+      </w:r>
+      <w:proofErr w:type="spellStart"/>
+      <w:r>
+        <w:rPr>
+          <w:rFonts w:ascii="Times New Roman" w:hAnsi="Times New Roman" w:cs="Times New Roman"/>
+          <w:b w:val="0"/>
+          <w:sz w:val="24"/>
+          <w:szCs w:val="24"/>
+          <w:lang w:val="en-US"/>
+        </w:rPr>
+        <w:t>yliopisto</w:t>
+      </w:r>
+      <w:proofErr w:type="spellEnd"/>
     </w:p>
     <w:p>
       <w:pPr>
@@ -771,7 +817,21 @@
         <w:rPr>
           <w:lang w:val="en-US"/>
         </w:rPr>
-        <w:t xml:space="preserve">Created also files inside “Coursework” folder and connected css with html file. </w:t>
+        <w:t xml:space="preserve">Created also files inside “Coursework” folder and connected </w:t>
+      </w:r>
+      <w:proofErr w:type="spellStart"/>
+      <w:r>
+        <w:rPr>
+          <w:lang w:val="en-US"/>
+        </w:rPr>
+        <w:t>css</w:t>
+      </w:r>
+      <w:proofErr w:type="spellEnd"/>
+      <w:r>
+        <w:rPr>
+          <w:lang w:val="en-US"/>
+        </w:rPr>
+        <w:t xml:space="preserve"> with html file. </w:t>
       </w:r>
       <w:r>
         <w:rPr>
@@ -917,7 +977,35 @@
         <w:rPr>
           <w:lang w:val="en-US"/>
         </w:rPr>
-        <w:t xml:space="preserve">Creating the card p styles is a bit over engineered, I think. Instead of using nth-child we could just easily give classes for each as the structure is always the same. Maybe the point here is just to thought how those selectors work. I would use the nth-child if I have a list of </w:t>
+        <w:t xml:space="preserve">Creating the card p styles is a bit over engineered, I think. Instead of using </w:t>
+      </w:r>
+      <w:proofErr w:type="gramStart"/>
+      <w:r>
+        <w:rPr>
+          <w:lang w:val="en-US"/>
+        </w:rPr>
+        <w:t>nth-child</w:t>
+      </w:r>
+      <w:proofErr w:type="gramEnd"/>
+      <w:r>
+        <w:rPr>
+          <w:lang w:val="en-US"/>
+        </w:rPr>
+        <w:t xml:space="preserve"> we could just easily give classes for each as the structure is always the same. Maybe the point here is just to thought how those selectors work. I would use the </w:t>
+      </w:r>
+      <w:proofErr w:type="gramStart"/>
+      <w:r>
+        <w:rPr>
+          <w:lang w:val="en-US"/>
+        </w:rPr>
+        <w:t>nth-child</w:t>
+      </w:r>
+      <w:proofErr w:type="gramEnd"/>
+      <w:r>
+        <w:rPr>
+          <w:lang w:val="en-US"/>
+        </w:rPr>
+        <w:t xml:space="preserve"> if I have a list of </w:t>
       </w:r>
       <w:r>
         <w:rPr>
@@ -982,13 +1070,27 @@
         <w:rPr>
           <w:lang w:val="en-US"/>
         </w:rPr>
-        <w:t xml:space="preserve"> (at 01:07) </w:t>
-      </w:r>
-      <w:r>
-        <w:rPr>
-          <w:lang w:val="en-US"/>
-        </w:rPr>
-        <w:t xml:space="preserve"> as on the video. CSS file is read from top to bottom. </w:t>
+        <w:t xml:space="preserve"> (at 01:07</w:t>
+      </w:r>
+      <w:proofErr w:type="gramStart"/>
+      <w:r>
+        <w:rPr>
+          <w:lang w:val="en-US"/>
+        </w:rPr>
+        <w:t xml:space="preserve">) </w:t>
+      </w:r>
+      <w:r>
+        <w:rPr>
+          <w:lang w:val="en-US"/>
+        </w:rPr>
+        <w:t xml:space="preserve"> as</w:t>
+      </w:r>
+      <w:proofErr w:type="gramEnd"/>
+      <w:r>
+        <w:rPr>
+          <w:lang w:val="en-US"/>
+        </w:rPr>
+        <w:t xml:space="preserve"> on the video. CSS file is read from top to bottom. </w:t>
       </w:r>
     </w:p>
     <w:p>
@@ -1011,6 +1113,136 @@
           <w:lang w:val="en-US"/>
         </w:rPr>
         <w:t>Pricing section finalized. I maybe missed something on the video as at the end I had the pricing cards aligned little bit different. I added for the pricing grid align-items center and that fixed the issue.</w:t>
+      </w:r>
+    </w:p>
+    <w:p>
+      <w:pPr>
+        <w:pStyle w:val="BodyText"/>
+        <w:rPr>
+          <w:lang w:val="en-US"/>
+        </w:rPr>
+      </w:pPr>
+    </w:p>
+    <w:p>
+      <w:pPr>
+        <w:pStyle w:val="BodyText"/>
+        <w:rPr>
+          <w:lang w:val="en-US"/>
+        </w:rPr>
+      </w:pPr>
+      <w:r>
+        <w:rPr>
+          <w:lang w:val="en-US"/>
+        </w:rPr>
+        <w:t xml:space="preserve">I am okay at coding in </w:t>
+      </w:r>
+      <w:proofErr w:type="gramStart"/>
+      <w:r>
+        <w:rPr>
+          <w:lang w:val="en-US"/>
+        </w:rPr>
+        <w:t>JS</w:t>
+      </w:r>
+      <w:proofErr w:type="gramEnd"/>
+      <w:r>
+        <w:rPr>
+          <w:lang w:val="en-US"/>
+        </w:rPr>
+        <w:t xml:space="preserve"> but I haven’t done the basics for a long time. </w:t>
+      </w:r>
+      <w:r>
+        <w:rPr>
+          <w:lang w:val="en-US"/>
+        </w:rPr>
+        <w:t>Also,</w:t>
+      </w:r>
+      <w:r>
+        <w:rPr>
+          <w:lang w:val="en-US"/>
+        </w:rPr>
+        <w:t xml:space="preserve"> when AI has become </w:t>
+      </w:r>
+      <w:r>
+        <w:rPr>
+          <w:lang w:val="en-US"/>
+        </w:rPr>
+        <w:t xml:space="preserve">useful it’s interesting to back to basics. The JS part is quite simple as you only need to listen to basic HTML elements and clicking action. </w:t>
+      </w:r>
+    </w:p>
+    <w:p>
+      <w:pPr>
+        <w:pStyle w:val="BodyText"/>
+        <w:rPr>
+          <w:lang w:val="en-US"/>
+        </w:rPr>
+      </w:pPr>
+    </w:p>
+    <w:p>
+      <w:pPr>
+        <w:pStyle w:val="BodyText"/>
+        <w:rPr>
+          <w:lang w:val="en-US"/>
+        </w:rPr>
+      </w:pPr>
+      <w:r>
+        <w:rPr>
+          <w:lang w:val="en-US"/>
+        </w:rPr>
+        <w:t xml:space="preserve">There was minor typo on JS. I mistyped </w:t>
+      </w:r>
+      <w:proofErr w:type="spellStart"/>
+      <w:r>
+        <w:rPr>
+          <w:lang w:val="en-GB"/>
+        </w:rPr>
+        <w:t>otherGroup</w:t>
+      </w:r>
+      <w:proofErr w:type="spellEnd"/>
+      <w:r>
+        <w:rPr>
+          <w:lang w:val="en-GB"/>
+        </w:rPr>
+        <w:t xml:space="preserve"> as </w:t>
+      </w:r>
+      <w:proofErr w:type="spellStart"/>
+      <w:r>
+        <w:rPr>
+          <w:lang w:val="en-GB"/>
+        </w:rPr>
+        <w:t>other</w:t>
+      </w:r>
+      <w:r>
+        <w:rPr>
+          <w:lang w:val="en-GB"/>
+        </w:rPr>
+        <w:t>g</w:t>
+      </w:r>
+      <w:r>
+        <w:rPr>
+          <w:lang w:val="en-GB"/>
+        </w:rPr>
+        <w:t>roup</w:t>
+      </w:r>
+      <w:proofErr w:type="spellEnd"/>
+      <w:r>
+        <w:rPr>
+          <w:lang w:val="en-GB"/>
+        </w:rPr>
+        <w:t xml:space="preserve"> on the if check and that caused a bug so other </w:t>
+      </w:r>
+      <w:proofErr w:type="spellStart"/>
+      <w:r>
+        <w:rPr>
+          <w:lang w:val="en-GB"/>
+        </w:rPr>
+        <w:t>faqs</w:t>
+      </w:r>
+      <w:proofErr w:type="spellEnd"/>
+      <w:r>
+        <w:rPr>
+          <w:lang w:val="en-GB"/>
+        </w:rPr>
+        <w:t xml:space="preserve"> didn’t close when one was opened.</w:t>
       </w:r>
     </w:p>
     <w:p>

</xml_diff>

<commit_message>
finalised the learning diary and added Coursework live website link also on the project
</commit_message>
<xml_diff>
--- a/LearningDiary/SDS_learning_diary_Miro_Kymäläinen.docx
+++ b/LearningDiary/SDS_learning_diary_Miro_Kymäläinen.docx
@@ -481,7 +481,13 @@
         <w:rPr>
           <w:lang w:val="en-US"/>
         </w:rPr>
-        <w:t>Finalised project, deployed coursework.</w:t>
+        <w:t>Finalized</w:t>
+      </w:r>
+      <w:r>
+        <w:rPr>
+          <w:lang w:val="en-US"/>
+        </w:rPr>
+        <w:t xml:space="preserve"> project, deployed coursework.</w:t>
       </w:r>
     </w:p>
     <w:p>
@@ -618,19 +624,7 @@
         <w:rPr>
           <w:lang w:val="en-US"/>
         </w:rPr>
-        <w:t>2</w:t>
-      </w:r>
-      <w:r>
-        <w:rPr>
-          <w:lang w:val="en-US"/>
-        </w:rPr>
-        <w:t>9</w:t>
-      </w:r>
-      <w:r>
-        <w:rPr>
-          <w:lang w:val="en-US"/>
-        </w:rPr>
-        <w:t>.5.2026</w:t>
+        <w:t>29.5.2026</w:t>
       </w:r>
     </w:p>
     <w:p>
@@ -645,6 +639,12 @@
         </w:rPr>
         <w:t xml:space="preserve">Activity: </w:t>
       </w:r>
+      <w:r>
+        <w:rPr>
+          <w:lang w:val="en-US"/>
+        </w:rPr>
+        <w:t>Completed the website</w:t>
+      </w:r>
     </w:p>
     <w:p>
       <w:pPr>
@@ -658,95 +658,24 @@
         </w:rPr>
         <w:t xml:space="preserve">Learning outcome: </w:t>
       </w:r>
-    </w:p>
-    <w:p>
-      <w:pPr>
-        <w:rPr>
-          <w:lang w:val="en-US"/>
-        </w:rPr>
-      </w:pPr>
-    </w:p>
-    <w:p>
-      <w:pPr>
-        <w:rPr>
-          <w:lang w:val="en-US"/>
-        </w:rPr>
-      </w:pPr>
-    </w:p>
-    <w:p>
-      <w:pPr>
-        <w:rPr>
-          <w:lang w:val="en-US"/>
-        </w:rPr>
-      </w:pPr>
-    </w:p>
-    <w:p>
-      <w:pPr>
-        <w:rPr>
-          <w:lang w:val="en-US"/>
-        </w:rPr>
-      </w:pPr>
-    </w:p>
-    <w:p>
-      <w:pPr>
-        <w:rPr>
-          <w:lang w:val="en-US"/>
-        </w:rPr>
-      </w:pPr>
-    </w:p>
-    <w:p>
-      <w:pPr>
-        <w:rPr>
-          <w:lang w:val="en-US"/>
-        </w:rPr>
-      </w:pPr>
-    </w:p>
-    <w:p>
-      <w:pPr>
-        <w:rPr>
-          <w:lang w:val="en-US"/>
-        </w:rPr>
-      </w:pPr>
-    </w:p>
-    <w:p>
-      <w:pPr>
-        <w:rPr>
-          <w:lang w:val="en-US"/>
-        </w:rPr>
-      </w:pPr>
-    </w:p>
-    <w:p>
-      <w:pPr>
-        <w:rPr>
-          <w:lang w:val="en-US"/>
-        </w:rPr>
-      </w:pPr>
-    </w:p>
-    <w:p>
-      <w:pPr>
-        <w:pStyle w:val="IndexHeading"/>
-        <w:spacing w:line="360" w:lineRule="auto"/>
-        <w:rPr>
-          <w:lang w:val="en-US"/>
-        </w:rPr>
-      </w:pPr>
-    </w:p>
-    <w:p>
-      <w:pPr>
-        <w:pStyle w:val="IndexHeading"/>
-        <w:spacing w:line="360" w:lineRule="auto"/>
-        <w:rPr>
-          <w:lang w:val="en-US"/>
-        </w:rPr>
-      </w:pPr>
-    </w:p>
-    <w:p>
-      <w:pPr>
-        <w:pStyle w:val="IndexHeading"/>
-        <w:rPr>
-          <w:lang w:val="en-US"/>
-        </w:rPr>
-      </w:pPr>
+      <w:r>
+        <w:rPr>
+          <w:lang w:val="en-US"/>
+        </w:rPr>
+        <w:t xml:space="preserve">How to host pages on </w:t>
+      </w:r>
+      <w:r>
+        <w:rPr>
+          <w:lang w:val="en-US"/>
+        </w:rPr>
+        <w:t>GitHub</w:t>
+      </w:r>
+      <w:r>
+        <w:rPr>
+          <w:lang w:val="en-US"/>
+        </w:rPr>
+        <w:t xml:space="preserve"> pages</w:t>
+      </w:r>
     </w:p>
     <w:p>
       <w:pPr>
@@ -767,26 +696,16 @@
           <w:szCs w:val="28"/>
           <w:lang w:val="en-US"/>
         </w:rPr>
-        <w:br w:type="page"/>
-      </w:r>
-      <w:r>
+        <w:lastRenderedPageBreak/>
+        <w:t>LEARNING DIARY</w:t>
+      </w:r>
+    </w:p>
+    <w:p>
+      <w:pPr>
+        <w:pStyle w:val="BodyText"/>
         <w:rPr>
           <w:b/>
           <w:bCs/>
-          <w:sz w:val="28"/>
-          <w:szCs w:val="28"/>
-          <w:lang w:val="en-US"/>
-        </w:rPr>
-        <w:lastRenderedPageBreak/>
-        <w:t>LEARNING DIARY</w:t>
-      </w:r>
-    </w:p>
-    <w:p>
-      <w:pPr>
-        <w:pStyle w:val="BodyText"/>
-        <w:rPr>
-          <w:b/>
-          <w:bCs/>
           <w:lang w:val="en-US"/>
         </w:rPr>
       </w:pPr>
@@ -832,7 +751,21 @@
         <w:rPr>
           <w:lang w:val="en-US"/>
         </w:rPr>
-        <w:t xml:space="preserve"> I have existing Github account so decided to use that</w:t>
+        <w:t xml:space="preserve"> I have existing </w:t>
+      </w:r>
+      <w:proofErr w:type="spellStart"/>
+      <w:r>
+        <w:rPr>
+          <w:lang w:val="en-US"/>
+        </w:rPr>
+        <w:t>Github</w:t>
+      </w:r>
+      <w:proofErr w:type="spellEnd"/>
+      <w:r>
+        <w:rPr>
+          <w:lang w:val="en-US"/>
+        </w:rPr>
+        <w:t xml:space="preserve"> account so decided to use that</w:t>
       </w:r>
       <w:r>
         <w:rPr>
@@ -892,7 +825,21 @@
         <w:rPr>
           <w:lang w:val="en-US"/>
         </w:rPr>
-        <w:t>I viewed the coursework video. Now I have clear visio what to do. I also looked at the Figma and downloaded necessary image materials</w:t>
+        <w:t xml:space="preserve">I viewed the coursework video. Now I have clear </w:t>
+      </w:r>
+      <w:proofErr w:type="spellStart"/>
+      <w:r>
+        <w:rPr>
+          <w:lang w:val="en-US"/>
+        </w:rPr>
+        <w:t>visio</w:t>
+      </w:r>
+      <w:proofErr w:type="spellEnd"/>
+      <w:r>
+        <w:rPr>
+          <w:lang w:val="en-US"/>
+        </w:rPr>
+        <w:t xml:space="preserve"> what to do. I also looked at the Figma and downloaded necessary image materials</w:t>
       </w:r>
       <w:r>
         <w:rPr>
@@ -968,7 +915,19 @@
         <w:rPr>
           <w:lang w:val="en-US"/>
         </w:rPr>
-        <w:t xml:space="preserve">Created also files inside “Coursework” folder and connected css with html file. </w:t>
+        <w:t xml:space="preserve">Created also files inside “Coursework” folder and connected </w:t>
+      </w:r>
+      <w:r>
+        <w:rPr>
+          <w:lang w:val="en-US"/>
+        </w:rPr>
+        <w:t>CSS</w:t>
+      </w:r>
+      <w:r>
+        <w:rPr>
+          <w:lang w:val="en-US"/>
+        </w:rPr>
+        <w:t xml:space="preserve"> with html file. </w:t>
       </w:r>
       <w:r>
         <w:rPr>
@@ -1016,7 +975,21 @@
         <w:rPr>
           <w:lang w:val="en-US"/>
         </w:rPr>
-        <w:t>quite basic. I’m already familiar for instance, with border-box. For fonts instead of px I prefer using rems</w:t>
+        <w:t xml:space="preserve">quite basic. I’m already familiar for instance, with border-box. For fonts instead of </w:t>
+      </w:r>
+      <w:proofErr w:type="spellStart"/>
+      <w:r>
+        <w:rPr>
+          <w:lang w:val="en-US"/>
+        </w:rPr>
+        <w:t>px</w:t>
+      </w:r>
+      <w:proofErr w:type="spellEnd"/>
+      <w:r>
+        <w:rPr>
+          <w:lang w:val="en-US"/>
+        </w:rPr>
+        <w:t xml:space="preserve"> I prefer using rems</w:t>
       </w:r>
       <w:r>
         <w:rPr>
@@ -1080,7 +1053,19 @@
         <w:rPr>
           <w:lang w:val="en-US"/>
         </w:rPr>
-        <w:t>lucide icons</w:t>
+        <w:t>Lucide</w:t>
+      </w:r>
+      <w:r>
+        <w:rPr>
+          <w:lang w:val="en-US"/>
+        </w:rPr>
+        <w:t xml:space="preserve"> </w:t>
+      </w:r>
+      <w:r>
+        <w:rPr>
+          <w:lang w:val="en-US"/>
+        </w:rPr>
+        <w:t>Icons</w:t>
       </w:r>
       <w:r>
         <w:rPr>
@@ -1235,7 +1220,21 @@
         <w:rPr>
           <w:lang w:val="en-US"/>
         </w:rPr>
-        <w:t xml:space="preserve">I am okay at coding in JS but I haven’t done the basics for a long time. </w:t>
+        <w:t xml:space="preserve">I am okay at coding in </w:t>
+      </w:r>
+      <w:proofErr w:type="gramStart"/>
+      <w:r>
+        <w:rPr>
+          <w:lang w:val="en-US"/>
+        </w:rPr>
+        <w:t>JS</w:t>
+      </w:r>
+      <w:proofErr w:type="gramEnd"/>
+      <w:r>
+        <w:rPr>
+          <w:lang w:val="en-US"/>
+        </w:rPr>
+        <w:t xml:space="preserve"> but I haven’t done the basics for a long time. </w:t>
       </w:r>
       <w:r>
         <w:rPr>
@@ -1277,17 +1276,45 @@
         </w:rPr>
         <w:t xml:space="preserve">There was minor typo on JS. I mistyped </w:t>
       </w:r>
+      <w:proofErr w:type="spellStart"/>
       <w:r>
         <w:rPr>
           <w:lang w:val="en-GB"/>
         </w:rPr>
-        <w:t>otherGroup as othergroup</w:t>
-      </w:r>
+        <w:t>otherGroup</w:t>
+      </w:r>
+      <w:proofErr w:type="spellEnd"/>
       <w:r>
         <w:rPr>
           <w:lang w:val="en-GB"/>
         </w:rPr>
-        <w:t xml:space="preserve"> on the if check and that caused a bug so other faqs didn’t close when one was opened.</w:t>
+        <w:t xml:space="preserve"> as </w:t>
+      </w:r>
+      <w:proofErr w:type="spellStart"/>
+      <w:r>
+        <w:rPr>
+          <w:lang w:val="en-GB"/>
+        </w:rPr>
+        <w:t>othergroup</w:t>
+      </w:r>
+      <w:proofErr w:type="spellEnd"/>
+      <w:r>
+        <w:rPr>
+          <w:lang w:val="en-GB"/>
+        </w:rPr>
+        <w:t xml:space="preserve"> on the if check and that caused a bug so other </w:t>
+      </w:r>
+      <w:r>
+        <w:rPr>
+          <w:lang w:val="en-GB"/>
+        </w:rPr>
+        <w:t>FAQs</w:t>
+      </w:r>
+      <w:r>
+        <w:rPr>
+          <w:lang w:val="en-GB"/>
+        </w:rPr>
+        <w:t xml:space="preserve"> didn’t close when one was opened.</w:t>
       </w:r>
     </w:p>
     <w:p>
@@ -1349,73 +1376,139 @@
         <w:rPr>
           <w:lang w:val="en-US"/>
         </w:rPr>
-        <w:t xml:space="preserve"> there. The desktop version looks good to me and is very similar to the figma. </w:t>
-      </w:r>
-    </w:p>
-    <w:p>
-      <w:pPr>
-        <w:pStyle w:val="BodyText"/>
-        <w:rPr>
-          <w:lang w:val="en-US"/>
-        </w:rPr>
-      </w:pPr>
-    </w:p>
-    <w:p>
-      <w:pPr>
-        <w:pStyle w:val="BodyText"/>
-        <w:rPr>
-          <w:lang w:val="en-US"/>
-        </w:rPr>
-      </w:pPr>
-      <w:r>
-        <w:rPr>
-          <w:lang w:val="en-US"/>
-        </w:rPr>
-        <w:t>I tried to write the js all by myself first before watching the video for mobile menu. It was all right but again had a typo which caused the js not to work properly.</w:t>
-      </w:r>
-    </w:p>
-    <w:p>
-      <w:pPr>
-        <w:pStyle w:val="BodyText"/>
-        <w:rPr>
-          <w:lang w:val="en-US"/>
-        </w:rPr>
-      </w:pPr>
-    </w:p>
-    <w:p>
-      <w:pPr>
-        <w:pStyle w:val="BodyText"/>
-        <w:rPr>
-          <w:lang w:val="en-US"/>
-        </w:rPr>
-      </w:pPr>
-      <w:r>
-        <w:rPr>
-          <w:lang w:val="en-US"/>
-        </w:rPr>
-        <w:t>Finalised the mobile optimization.</w:t>
-      </w:r>
-    </w:p>
-    <w:p>
-      <w:pPr>
-        <w:pStyle w:val="BodyText"/>
-        <w:rPr>
-          <w:lang w:val="en-US"/>
-        </w:rPr>
-      </w:pPr>
-    </w:p>
-    <w:p>
-      <w:pPr>
-        <w:pStyle w:val="BodyText"/>
-        <w:rPr>
-          <w:lang w:val="en-US"/>
-        </w:rPr>
-      </w:pPr>
-      <w:r>
-        <w:rPr>
-          <w:lang w:val="en-US"/>
-        </w:rPr>
-        <w:t>After doing that I signd up on Netlify. There was minor issues with publishing the site as I forgot to set the Publish directory to “Coursework”</w:t>
+        <w:t xml:space="preserve"> there. The desktop version looks good to me and is very similar to the </w:t>
+      </w:r>
+      <w:r>
+        <w:rPr>
+          <w:lang w:val="en-US"/>
+        </w:rPr>
+        <w:t>Figma</w:t>
+      </w:r>
+      <w:r>
+        <w:rPr>
+          <w:lang w:val="en-US"/>
+        </w:rPr>
+        <w:t xml:space="preserve">. </w:t>
+      </w:r>
+    </w:p>
+    <w:p>
+      <w:pPr>
+        <w:pStyle w:val="BodyText"/>
+        <w:rPr>
+          <w:lang w:val="en-US"/>
+        </w:rPr>
+      </w:pPr>
+    </w:p>
+    <w:p>
+      <w:pPr>
+        <w:pStyle w:val="BodyText"/>
+        <w:rPr>
+          <w:lang w:val="en-US"/>
+        </w:rPr>
+      </w:pPr>
+      <w:r>
+        <w:rPr>
+          <w:lang w:val="en-US"/>
+        </w:rPr>
+        <w:t xml:space="preserve">I tried to write the </w:t>
+      </w:r>
+      <w:r>
+        <w:rPr>
+          <w:lang w:val="en-US"/>
+        </w:rPr>
+        <w:t xml:space="preserve">JS </w:t>
+      </w:r>
+      <w:r>
+        <w:rPr>
+          <w:lang w:val="en-US"/>
+        </w:rPr>
+        <w:t xml:space="preserve">all by myself first before watching the video for mobile menu. It was all right but again had a typo which caused the </w:t>
+      </w:r>
+      <w:r>
+        <w:rPr>
+          <w:lang w:val="en-US"/>
+        </w:rPr>
+        <w:t>JS</w:t>
+      </w:r>
+      <w:r>
+        <w:rPr>
+          <w:lang w:val="en-US"/>
+        </w:rPr>
+        <w:t xml:space="preserve"> not to work properly.</w:t>
+      </w:r>
+    </w:p>
+    <w:p>
+      <w:pPr>
+        <w:pStyle w:val="BodyText"/>
+        <w:rPr>
+          <w:lang w:val="en-US"/>
+        </w:rPr>
+      </w:pPr>
+    </w:p>
+    <w:p>
+      <w:pPr>
+        <w:pStyle w:val="BodyText"/>
+        <w:rPr>
+          <w:lang w:val="en-US"/>
+        </w:rPr>
+      </w:pPr>
+      <w:r>
+        <w:rPr>
+          <w:lang w:val="en-US"/>
+        </w:rPr>
+        <w:t>Finalized</w:t>
+      </w:r>
+      <w:r>
+        <w:rPr>
+          <w:lang w:val="en-US"/>
+        </w:rPr>
+        <w:t xml:space="preserve"> the mobile optimization.</w:t>
+      </w:r>
+    </w:p>
+    <w:p>
+      <w:pPr>
+        <w:pStyle w:val="BodyText"/>
+        <w:rPr>
+          <w:lang w:val="en-US"/>
+        </w:rPr>
+      </w:pPr>
+    </w:p>
+    <w:p>
+      <w:pPr>
+        <w:pStyle w:val="BodyText"/>
+        <w:rPr>
+          <w:lang w:val="en-US"/>
+        </w:rPr>
+      </w:pPr>
+      <w:r>
+        <w:rPr>
+          <w:lang w:val="en-US"/>
+        </w:rPr>
+        <w:t xml:space="preserve">After doing that I </w:t>
+      </w:r>
+      <w:r>
+        <w:rPr>
+          <w:lang w:val="en-US"/>
+        </w:rPr>
+        <w:t>signed</w:t>
+      </w:r>
+      <w:r>
+        <w:rPr>
+          <w:lang w:val="en-US"/>
+        </w:rPr>
+        <w:t xml:space="preserve"> up on Netlify. There </w:t>
+      </w:r>
+      <w:r>
+        <w:rPr>
+          <w:lang w:val="en-US"/>
+        </w:rPr>
+        <w:t>were</w:t>
+      </w:r>
+      <w:r>
+        <w:rPr>
+          <w:lang w:val="en-US"/>
+        </w:rPr>
+        <w:t xml:space="preserve"> minor issues with publishing the site as I forgot to set the Publish directory to “Coursework”</w:t>
       </w:r>
       <w:r>
         <w:rPr>
@@ -1557,7 +1650,19 @@
         <w:rPr>
           <w:lang w:val="en-US"/>
         </w:rPr>
-        <w:t xml:space="preserve"> Needed to use! imporant in a couple of places as I have card util class which may be needed to override party in some cases.</w:t>
+        <w:t xml:space="preserve"> Needed to use! </w:t>
+      </w:r>
+      <w:r>
+        <w:rPr>
+          <w:lang w:val="en-US"/>
+        </w:rPr>
+        <w:t>important</w:t>
+      </w:r>
+      <w:r>
+        <w:rPr>
+          <w:lang w:val="en-US"/>
+        </w:rPr>
+        <w:t xml:space="preserve"> in a couple of places as I have card util class which may be needed to override party in some cases.</w:t>
       </w:r>
     </w:p>
     <w:p>
@@ -1585,7 +1690,19 @@
         <w:rPr>
           <w:lang w:val="en-US"/>
         </w:rPr>
-        <w:t xml:space="preserve"> I will just download the icons as svg files in images folder. </w:t>
+        <w:t xml:space="preserve"> I will just download the icons as </w:t>
+      </w:r>
+      <w:r>
+        <w:rPr>
+          <w:lang w:val="en-US"/>
+        </w:rPr>
+        <w:t>SVG</w:t>
+      </w:r>
+      <w:r>
+        <w:rPr>
+          <w:lang w:val="en-US"/>
+        </w:rPr>
+        <w:t xml:space="preserve"> files in images folder. </w:t>
       </w:r>
     </w:p>
     <w:p>
@@ -1609,27 +1726,43 @@
         </w:rPr>
         <w:t>Finished structure for navigation, hero, about and projects section.</w:t>
       </w:r>
-    </w:p>
-    <w:p>
-      <w:pPr>
-        <w:pStyle w:val="BodyText"/>
-        <w:rPr>
-          <w:lang w:val="en-US"/>
-        </w:rPr>
-      </w:pPr>
-    </w:p>
-    <w:p>
-      <w:pPr>
-        <w:pStyle w:val="BodyText"/>
-        <w:rPr>
-          <w:lang w:val="en-US"/>
-        </w:rPr>
-      </w:pPr>
-      <w:r>
-        <w:rPr>
-          <w:lang w:val="en-US"/>
-        </w:rPr>
-        <w:t>I actually, also started creating contact section but I will mostly leave that for tomorrow.</w:t>
+      <w:r>
+        <w:rPr>
+          <w:lang w:val="en-US"/>
+        </w:rPr>
+        <w:t xml:space="preserve"> </w:t>
+      </w:r>
+      <w:proofErr w:type="gramStart"/>
+      <w:r>
+        <w:rPr>
+          <w:lang w:val="en-US"/>
+        </w:rPr>
+        <w:t>I,</w:t>
+      </w:r>
+      <w:proofErr w:type="gramEnd"/>
+      <w:r>
+        <w:rPr>
+          <w:lang w:val="en-US"/>
+        </w:rPr>
+        <w:t xml:space="preserve"> also</w:t>
+      </w:r>
+      <w:r>
+        <w:rPr>
+          <w:lang w:val="en-US"/>
+        </w:rPr>
+        <w:t xml:space="preserve"> started creating contact </w:t>
+      </w:r>
+      <w:r>
+        <w:rPr>
+          <w:lang w:val="en-US"/>
+        </w:rPr>
+        <w:t>section,</w:t>
+      </w:r>
+      <w:r>
+        <w:rPr>
+          <w:lang w:val="en-US"/>
+        </w:rPr>
+        <w:t xml:space="preserve"> but I will mostly leave that for tomorrow.</w:t>
       </w:r>
     </w:p>
     <w:p>
@@ -1660,62 +1793,186 @@
           <w:lang w:val="en-US"/>
         </w:rPr>
       </w:pPr>
-    </w:p>
-    <w:p>
-      <w:pPr>
-        <w:pStyle w:val="BodyText"/>
-        <w:rPr>
-          <w:lang w:val="en-US"/>
-        </w:rPr>
-      </w:pPr>
-      <w:r>
-        <w:rPr>
-          <w:lang w:val="en-US"/>
-        </w:rPr>
-        <w:t xml:space="preserve">Today I started with building conjtact section structure. I decided to add small heading for the setion. I </w:t>
-      </w:r>
-      <w:r>
-        <w:rPr>
-          <w:lang w:val="en-US"/>
-        </w:rPr>
-        <w:t>will use there small blob. First I thought to use ::before tag but it ended up being a bit over engineered at that point so just made .blob util class and replaced the ::before with basic div. Also made the Project section header similar.</w:t>
-      </w:r>
-    </w:p>
-    <w:p>
-      <w:pPr>
-        <w:pStyle w:val="BodyText"/>
-        <w:rPr>
-          <w:lang w:val="en-US"/>
-        </w:rPr>
-      </w:pPr>
-    </w:p>
-    <w:p>
-      <w:pPr>
-        <w:pStyle w:val="BodyText"/>
-        <w:rPr>
-          <w:lang w:val="en-US"/>
-        </w:rPr>
-      </w:pPr>
-      <w:r>
-        <w:rPr>
-          <w:lang w:val="en-US"/>
-        </w:rPr>
-        <w:t>Now I have the structure almost ready and I will start implementing styles. When I started doing styles I noticed some components had very similar styles but I had written the CSS multiple times. I decided to create couple more util classes and use them instead of writing the same code over and over again.</w:t>
-      </w:r>
-    </w:p>
-    <w:p>
-      <w:pPr>
-        <w:pStyle w:val="BodyText"/>
-        <w:rPr>
-          <w:lang w:val="en-US"/>
-        </w:rPr>
-      </w:pPr>
+      <w:r>
+        <w:rPr>
+          <w:lang w:val="en-US"/>
+        </w:rPr>
+        <w:t xml:space="preserve">Today I started with building </w:t>
+      </w:r>
+      <w:r>
+        <w:rPr>
+          <w:lang w:val="en-US"/>
+        </w:rPr>
+        <w:t>contact</w:t>
+      </w:r>
+      <w:r>
+        <w:rPr>
+          <w:lang w:val="en-US"/>
+        </w:rPr>
+        <w:t xml:space="preserve"> section structure. I decided to add small heading for the </w:t>
+      </w:r>
+      <w:r>
+        <w:rPr>
+          <w:lang w:val="en-US"/>
+        </w:rPr>
+        <w:t>section</w:t>
+      </w:r>
+      <w:r>
+        <w:rPr>
+          <w:lang w:val="en-US"/>
+        </w:rPr>
+        <w:t xml:space="preserve">. I </w:t>
+      </w:r>
+      <w:r>
+        <w:rPr>
+          <w:lang w:val="en-US"/>
+        </w:rPr>
+        <w:t xml:space="preserve">will use </w:t>
+      </w:r>
+      <w:proofErr w:type="gramStart"/>
+      <w:r>
+        <w:rPr>
+          <w:lang w:val="en-US"/>
+        </w:rPr>
+        <w:t>there</w:t>
+      </w:r>
+      <w:proofErr w:type="gramEnd"/>
+      <w:r>
+        <w:rPr>
+          <w:lang w:val="en-US"/>
+        </w:rPr>
+        <w:t xml:space="preserve"> small blob. </w:t>
+      </w:r>
+      <w:r>
+        <w:rPr>
+          <w:lang w:val="en-US"/>
+        </w:rPr>
+        <w:t>First,</w:t>
+      </w:r>
+      <w:r>
+        <w:rPr>
+          <w:lang w:val="en-US"/>
+        </w:rPr>
+        <w:t xml:space="preserve"> I thought to </w:t>
+      </w:r>
+      <w:proofErr w:type="gramStart"/>
+      <w:r>
+        <w:rPr>
+          <w:lang w:val="en-US"/>
+        </w:rPr>
+        <w:t>use ::before</w:t>
+      </w:r>
+      <w:proofErr w:type="gramEnd"/>
+      <w:r>
+        <w:rPr>
+          <w:lang w:val="en-US"/>
+        </w:rPr>
+        <w:t xml:space="preserve"> tag but it ended up being a bit over engineered at that point so just made .blob util class and replaced </w:t>
+      </w:r>
+      <w:proofErr w:type="gramStart"/>
+      <w:r>
+        <w:rPr>
+          <w:lang w:val="en-US"/>
+        </w:rPr>
+        <w:t>the ::before</w:t>
+      </w:r>
+      <w:proofErr w:type="gramEnd"/>
+      <w:r>
+        <w:rPr>
+          <w:lang w:val="en-US"/>
+        </w:rPr>
+        <w:t xml:space="preserve"> with basic div. Also made the Project section header similar.</w:t>
+      </w:r>
+    </w:p>
+    <w:p>
+      <w:pPr>
+        <w:pStyle w:val="BodyText"/>
+        <w:rPr>
+          <w:lang w:val="en-US"/>
+        </w:rPr>
+      </w:pPr>
+    </w:p>
+    <w:p>
+      <w:pPr>
+        <w:pStyle w:val="BodyText"/>
+        <w:rPr>
+          <w:lang w:val="en-US"/>
+        </w:rPr>
+      </w:pPr>
+      <w:r>
+        <w:rPr>
+          <w:lang w:val="en-US"/>
+        </w:rPr>
+        <w:t xml:space="preserve">Now I have the structure almost </w:t>
+      </w:r>
+      <w:r>
+        <w:rPr>
+          <w:lang w:val="en-US"/>
+        </w:rPr>
+        <w:t>ready,</w:t>
+      </w:r>
+      <w:r>
+        <w:rPr>
+          <w:lang w:val="en-US"/>
+        </w:rPr>
+        <w:t xml:space="preserve"> and I will start implementing styles. When I started doing </w:t>
+      </w:r>
+      <w:r>
+        <w:rPr>
+          <w:lang w:val="en-US"/>
+        </w:rPr>
+        <w:t>styles,</w:t>
+      </w:r>
+      <w:r>
+        <w:rPr>
+          <w:lang w:val="en-US"/>
+        </w:rPr>
+        <w:t xml:space="preserve"> I noticed some components had very similar </w:t>
+      </w:r>
+      <w:r>
+        <w:rPr>
+          <w:lang w:val="en-US"/>
+        </w:rPr>
+        <w:t>styles,</w:t>
+      </w:r>
+      <w:r>
+        <w:rPr>
+          <w:lang w:val="en-US"/>
+        </w:rPr>
+        <w:t xml:space="preserve"> but I had written the CSS multiple times. I decided to create couple more util classes and use them instead of writing the same code </w:t>
+      </w:r>
+      <w:r>
+        <w:rPr>
+          <w:lang w:val="en-US"/>
+        </w:rPr>
+        <w:t>repeatedly</w:t>
+      </w:r>
+      <w:r>
+        <w:rPr>
+          <w:lang w:val="en-US"/>
+        </w:rPr>
+        <w:t>.</w:t>
+      </w:r>
+    </w:p>
+    <w:p>
+      <w:pPr>
+        <w:pStyle w:val="BodyText"/>
+        <w:rPr>
+          <w:lang w:val="en-US"/>
+        </w:rPr>
+      </w:pPr>
+      <w:r>
+        <w:rPr>
+          <w:lang w:val="en-US"/>
+        </w:rPr>
+        <w:t xml:space="preserve">I think the text util classes helped to make the project much better looking. The grids make nice structure and heading between are also nice, I think. I have now also done the styling. </w:t>
+      </w:r>
       <w:r>
         <w:rPr>
           <w:lang w:val="en-US"/>
         </w:rPr>
         <w:lastRenderedPageBreak/>
-        <w:t>I think the text util classes helped to make the project much better looking. The grids make nice structure and heading between are also nice, I think. I have now also done the styling. Next, I will do the mobile optimization. After that I will review everything and look for if there is anything I should optimize, mostly regarding the html.</w:t>
+        <w:t>Next, I will do the mobile optimization. After that I will review everything and look for if there is anything I should optimize, mostly regarding the html.</w:t>
       </w:r>
       <w:r>
         <w:rPr>
@@ -1804,16 +2061,32 @@
         <w:rPr>
           <w:lang w:val="en-US"/>
         </w:rPr>
-        <w:t xml:space="preserve"> For doing the optimization its really handy to use browser inspect tools and the toggle device option for screen size simulation. </w:t>
-      </w:r>
-    </w:p>
-    <w:p>
-      <w:pPr>
-        <w:pStyle w:val="BodyText"/>
-        <w:rPr>
-          <w:lang w:val="en-US"/>
-        </w:rPr>
-      </w:pPr>
+        <w:t xml:space="preserve"> For doing the optimization </w:t>
+      </w:r>
+      <w:r>
+        <w:rPr>
+          <w:lang w:val="en-US"/>
+        </w:rPr>
+        <w:t>it’s</w:t>
+      </w:r>
+      <w:r>
+        <w:rPr>
+          <w:lang w:val="en-US"/>
+        </w:rPr>
+        <w:t xml:space="preserve"> </w:t>
+      </w:r>
+      <w:r>
+        <w:rPr>
+          <w:lang w:val="en-US"/>
+        </w:rPr>
+        <w:t>handy</w:t>
+      </w:r>
+      <w:r>
+        <w:rPr>
+          <w:lang w:val="en-US"/>
+        </w:rPr>
+        <w:t xml:space="preserve"> to use browser inspect tools and the toggle device option for screen size simulation. </w:t>
+      </w:r>
     </w:p>
     <w:p>
       <w:pPr>
@@ -1834,7 +2107,25 @@
         <w:rPr>
           <w:lang w:val="en-US"/>
         </w:rPr>
-        <w:t xml:space="preserve">I have doen the optimization. It was </w:t>
+        <w:t>Next, I</w:t>
+      </w:r>
+      <w:r>
+        <w:rPr>
+          <w:lang w:val="en-US"/>
+        </w:rPr>
+        <w:t xml:space="preserve"> </w:t>
+      </w:r>
+      <w:r>
+        <w:rPr>
+          <w:lang w:val="en-US"/>
+        </w:rPr>
+        <w:t>must do</w:t>
+      </w:r>
+      <w:r>
+        <w:rPr>
+          <w:lang w:val="en-US"/>
+        </w:rPr>
+        <w:t xml:space="preserve"> the optimization. It was </w:t>
       </w:r>
       <w:r>
         <w:rPr>
@@ -1858,183 +2149,303 @@
         <w:rPr>
           <w:lang w:val="en-US"/>
         </w:rPr>
+        <w:t xml:space="preserve">ed to </w:t>
+      </w:r>
+      <w:r>
+        <w:rPr>
+          <w:lang w:val="en-US"/>
+        </w:rPr>
+        <w:t>use</w:t>
+      </w:r>
+      <w:r>
+        <w:rPr>
+          <w:lang w:val="en-US"/>
+        </w:rPr>
+        <w:t xml:space="preserve"> “</w:t>
+      </w:r>
+      <w:r>
+        <w:rPr>
+          <w:lang w:val="en-US"/>
+        </w:rPr>
+        <w:t>!important</w:t>
+      </w:r>
+      <w:r>
+        <w:rPr>
+          <w:lang w:val="en-US"/>
+        </w:rPr>
+        <w:t>”</w:t>
+      </w:r>
+      <w:r>
+        <w:rPr>
+          <w:lang w:val="en-US"/>
+        </w:rPr>
+        <w:t xml:space="preserve"> in a couple of places but minimal use for that should be ok. </w:t>
+      </w:r>
+    </w:p>
+    <w:p>
+      <w:pPr>
+        <w:pStyle w:val="BodyText"/>
+        <w:rPr>
+          <w:lang w:val="en-US"/>
+        </w:rPr>
+      </w:pPr>
+    </w:p>
+    <w:p>
+      <w:pPr>
+        <w:pStyle w:val="BodyText"/>
+        <w:rPr>
+          <w:lang w:val="en-US"/>
+        </w:rPr>
+      </w:pPr>
+      <w:r>
+        <w:rPr>
+          <w:lang w:val="en-US"/>
+        </w:rPr>
+        <w:t xml:space="preserve">I took the mobile hamburger menu html and </w:t>
+      </w:r>
+      <w:r>
+        <w:rPr>
+          <w:lang w:val="en-US"/>
+        </w:rPr>
+        <w:t>CSS</w:t>
+      </w:r>
+      <w:r>
+        <w:rPr>
+          <w:lang w:val="en-US"/>
+        </w:rPr>
+        <w:t xml:space="preserve"> from coursework as it’s easy to create but just takes a bit time. I will re-create the mobile menu </w:t>
+      </w:r>
+      <w:r>
+        <w:rPr>
+          <w:lang w:val="en-US"/>
+        </w:rPr>
+        <w:t>but, in a bit,</w:t>
+      </w:r>
+      <w:r>
+        <w:rPr>
+          <w:lang w:val="en-US"/>
+        </w:rPr>
+        <w:t xml:space="preserve"> different way. Let’s see how it turns out as it should open from upside. </w:t>
+      </w:r>
+    </w:p>
+    <w:p>
+      <w:pPr>
+        <w:pStyle w:val="BodyText"/>
+        <w:rPr>
+          <w:lang w:val="en-US"/>
+        </w:rPr>
+      </w:pPr>
+    </w:p>
+    <w:p>
+      <w:pPr>
+        <w:pStyle w:val="BodyText"/>
+        <w:rPr>
+          <w:lang w:val="en-US"/>
+        </w:rPr>
+      </w:pPr>
+      <w:r>
+        <w:rPr>
+          <w:lang w:val="en-US"/>
+        </w:rPr>
+        <w:t>The mobile menu is a bit tricky but mostly the site is ready. I also crated contact page which I will implement tomorrow.</w:t>
+      </w:r>
+    </w:p>
+    <w:p>
+      <w:pPr>
+        <w:pStyle w:val="BodyText"/>
+        <w:rPr>
+          <w:lang w:val="en-US"/>
+        </w:rPr>
+      </w:pPr>
+    </w:p>
+    <w:p>
+      <w:pPr>
+        <w:pStyle w:val="BodyText"/>
+        <w:rPr>
+          <w:lang w:val="en-US"/>
+        </w:rPr>
+      </w:pPr>
+      <w:r>
+        <w:rPr>
+          <w:lang w:val="en-US"/>
+        </w:rPr>
+        <w:t>29.5</w:t>
+      </w:r>
+      <w:r>
+        <w:rPr>
+          <w:lang w:val="en-US"/>
+        </w:rPr>
+        <w:t>.2026</w:t>
+      </w:r>
+    </w:p>
+    <w:p>
+      <w:pPr>
+        <w:pStyle w:val="BodyText"/>
+        <w:rPr>
+          <w:lang w:val="en-US"/>
+        </w:rPr>
+      </w:pPr>
+      <w:r>
+        <w:rPr>
+          <w:lang w:val="en-US"/>
+        </w:rPr>
+        <w:t xml:space="preserve">I started by finalizing mobile menu popover. I got it working btu I had a problem. If the mobile menu was </w:t>
+      </w:r>
+      <w:r>
+        <w:rPr>
+          <w:lang w:val="en-US"/>
+        </w:rPr>
+        <w:t>opened</w:t>
+      </w:r>
+      <w:r>
+        <w:rPr>
+          <w:lang w:val="en-US"/>
+        </w:rPr>
+        <w:t xml:space="preserve"> and the screen size widened the hamburger icon would </w:t>
+      </w:r>
+      <w:r>
+        <w:rPr>
+          <w:lang w:val="en-US"/>
+        </w:rPr>
+        <w:t>disappears,</w:t>
+      </w:r>
+      <w:r>
+        <w:rPr>
+          <w:lang w:val="en-US"/>
+        </w:rPr>
+        <w:t xml:space="preserve"> but the menu would be left open. Even this is unlikely happening on production I needed to fix the issues. I added one media query below -mobile-</w:t>
+      </w:r>
+      <w:proofErr w:type="gramStart"/>
+      <w:r>
+        <w:rPr>
+          <w:lang w:val="en-US"/>
+        </w:rPr>
+        <w:t>menue.active</w:t>
+      </w:r>
+      <w:proofErr w:type="gramEnd"/>
+      <w:r>
+        <w:rPr>
+          <w:lang w:val="en-US"/>
+        </w:rPr>
+        <w:t xml:space="preserve"> so that fixed the issue.</w:t>
+      </w:r>
+    </w:p>
+    <w:p>
+      <w:pPr>
+        <w:pStyle w:val="BodyText"/>
+        <w:rPr>
+          <w:lang w:val="en-US"/>
+        </w:rPr>
+      </w:pPr>
+    </w:p>
+    <w:p>
+      <w:pPr>
+        <w:pStyle w:val="BodyText"/>
+        <w:rPr>
+          <w:lang w:val="en-US"/>
+        </w:rPr>
+      </w:pPr>
+      <w:r>
+        <w:rPr>
+          <w:lang w:val="en-US"/>
+        </w:rPr>
+        <w:t>Next,</w:t>
+      </w:r>
+      <w:r>
+        <w:rPr>
+          <w:lang w:val="en-US"/>
+        </w:rPr>
+        <w:t xml:space="preserve"> I will once </w:t>
+      </w:r>
+      <w:r>
+        <w:rPr>
+          <w:lang w:val="en-US"/>
+        </w:rPr>
+        <w:t>review</w:t>
+      </w:r>
+      <w:r>
+        <w:rPr>
+          <w:lang w:val="en-US"/>
+        </w:rPr>
+        <w:t xml:space="preserve"> everything and then build the Contact page, which is going to be very simple. </w:t>
+      </w:r>
+    </w:p>
+    <w:p>
+      <w:pPr>
+        <w:pStyle w:val="BodyText"/>
+        <w:rPr>
+          <w:lang w:val="en-US"/>
+        </w:rPr>
+      </w:pPr>
+    </w:p>
+    <w:p>
+      <w:pPr>
+        <w:pStyle w:val="BodyText"/>
+        <w:rPr>
+          <w:lang w:val="en-US"/>
+        </w:rPr>
+      </w:pPr>
+      <w:r>
+        <w:rPr>
+          <w:lang w:val="en-US"/>
+        </w:rPr>
+        <w:t xml:space="preserve">After I finalized the contact page and started </w:t>
+      </w:r>
+      <w:proofErr w:type="gramStart"/>
+      <w:r>
+        <w:rPr>
+          <w:lang w:val="en-US"/>
+        </w:rPr>
+        <w:t>deploying</w:t>
+      </w:r>
+      <w:proofErr w:type="gramEnd"/>
+      <w:r>
+        <w:rPr>
+          <w:lang w:val="en-US"/>
+        </w:rPr>
         <w:t xml:space="preserve"> </w:t>
       </w:r>
       <w:r>
         <w:rPr>
           <w:lang w:val="en-US"/>
         </w:rPr>
-        <w:t>ed</w:t>
-      </w:r>
-      <w:r>
-        <w:rPr>
-          <w:lang w:val="en-US"/>
-        </w:rPr>
-        <w:t xml:space="preserve">to </w:t>
-      </w:r>
-      <w:r>
-        <w:rPr>
-          <w:lang w:val="en-US"/>
-        </w:rPr>
-        <w:t>use! important</w:t>
-      </w:r>
-      <w:r>
-        <w:rPr>
-          <w:lang w:val="en-US"/>
-        </w:rPr>
-        <w:t xml:space="preserve"> in a couple of places but minimal use for that should be ok. </w:t>
-      </w:r>
-    </w:p>
-    <w:p>
-      <w:pPr>
-        <w:pStyle w:val="BodyText"/>
-        <w:rPr>
-          <w:lang w:val="en-US"/>
-        </w:rPr>
-      </w:pPr>
-    </w:p>
-    <w:p>
-      <w:pPr>
-        <w:pStyle w:val="BodyText"/>
-        <w:rPr>
-          <w:lang w:val="en-US"/>
-        </w:rPr>
-      </w:pPr>
-      <w:r>
-        <w:rPr>
-          <w:lang w:val="en-US"/>
-        </w:rPr>
-        <w:t xml:space="preserve">I took the mobile hamburger menu html and css from coursework as it’s easy to create but just takes a bit time. I will re-create the mobile menu </w:t>
-      </w:r>
-      <w:r>
-        <w:rPr>
-          <w:lang w:val="en-US"/>
-        </w:rPr>
-        <w:t>but, in a bit,</w:t>
-      </w:r>
-      <w:r>
-        <w:rPr>
-          <w:lang w:val="en-US"/>
-        </w:rPr>
-        <w:t xml:space="preserve"> different way. Let’s see how it turns out as it should open from upside. </w:t>
-      </w:r>
-    </w:p>
-    <w:p>
-      <w:pPr>
-        <w:pStyle w:val="BodyText"/>
-        <w:rPr>
-          <w:lang w:val="en-US"/>
-        </w:rPr>
-      </w:pPr>
-    </w:p>
-    <w:p>
-      <w:pPr>
-        <w:pStyle w:val="BodyText"/>
-        <w:rPr>
-          <w:lang w:val="en-US"/>
-        </w:rPr>
-      </w:pPr>
-      <w:r>
-        <w:rPr>
-          <w:lang w:val="en-US"/>
-        </w:rPr>
-        <w:t>The mobile menu is a bit tricky but mostly the site is ready. I also crated contact page which I will implement tomorrow.</w:t>
-      </w:r>
-    </w:p>
-    <w:p>
-      <w:pPr>
-        <w:pStyle w:val="BodyText"/>
-        <w:rPr>
-          <w:lang w:val="en-US"/>
-        </w:rPr>
-      </w:pPr>
-    </w:p>
-    <w:p>
-      <w:pPr>
-        <w:pStyle w:val="BodyText"/>
-        <w:rPr>
-          <w:lang w:val="en-US"/>
-        </w:rPr>
-      </w:pPr>
-      <w:r>
-        <w:rPr>
-          <w:lang w:val="en-US"/>
-        </w:rPr>
-        <w:t>29.5</w:t>
-      </w:r>
-    </w:p>
-    <w:p>
-      <w:pPr>
-        <w:pStyle w:val="BodyText"/>
-        <w:rPr>
-          <w:lang w:val="en-US"/>
-        </w:rPr>
-      </w:pPr>
-    </w:p>
-    <w:p>
-      <w:pPr>
-        <w:pStyle w:val="BodyText"/>
-        <w:rPr>
-          <w:lang w:val="en-US"/>
-        </w:rPr>
-      </w:pPr>
-      <w:r>
-        <w:rPr>
-          <w:lang w:val="en-US"/>
-        </w:rPr>
-        <w:t xml:space="preserve">I started by finalizing mobile menu popover. I got it working btu I had a problem. If the mobile menu was </w:t>
-      </w:r>
-      <w:r>
-        <w:rPr>
-          <w:lang w:val="en-US"/>
-        </w:rPr>
-        <w:t>opened</w:t>
-      </w:r>
-      <w:r>
-        <w:rPr>
-          <w:lang w:val="en-US"/>
-        </w:rPr>
-        <w:t xml:space="preserve"> and the screen size widened the hamburger icon would disappears but the menu would be left open. Even this is unlikely happening on production I needed to fix the issues. I added one media query below -mobile-menue.active so that fixed the issue.</w:t>
-      </w:r>
-    </w:p>
-    <w:p>
-      <w:pPr>
-        <w:pStyle w:val="BodyText"/>
-        <w:rPr>
-          <w:lang w:val="en-US"/>
-        </w:rPr>
-      </w:pPr>
-    </w:p>
-    <w:p>
-      <w:pPr>
-        <w:pStyle w:val="BodyText"/>
-        <w:rPr>
-          <w:lang w:val="en-US"/>
-        </w:rPr>
-      </w:pPr>
-      <w:r>
-        <w:rPr>
-          <w:lang w:val="en-US"/>
-        </w:rPr>
-        <w:t>Next,</w:t>
-      </w:r>
-      <w:r>
-        <w:rPr>
-          <w:lang w:val="en-US"/>
-        </w:rPr>
-        <w:t xml:space="preserve"> I will once </w:t>
-      </w:r>
-      <w:r>
-        <w:rPr>
-          <w:lang w:val="en-US"/>
-        </w:rPr>
-        <w:t>review</w:t>
-      </w:r>
-      <w:r>
-        <w:rPr>
-          <w:lang w:val="en-US"/>
-        </w:rPr>
-        <w:t xml:space="preserve"> everything and then build the Contact page, which is going to be very simple. </w:t>
+        <w:t xml:space="preserve">I realized I accidentally published the Coursework on Netlify instead on </w:t>
+      </w:r>
+      <w:r>
+        <w:rPr>
+          <w:lang w:val="en-US"/>
+        </w:rPr>
+        <w:t>GitHub</w:t>
+      </w:r>
+      <w:r>
+        <w:rPr>
+          <w:lang w:val="en-US"/>
+        </w:rPr>
+        <w:t xml:space="preserve"> Pages. I will </w:t>
+      </w:r>
+      <w:r>
+        <w:rPr>
+          <w:lang w:val="en-US"/>
+        </w:rPr>
+        <w:t>publish</w:t>
+      </w:r>
+      <w:r>
+        <w:rPr>
+          <w:lang w:val="en-US"/>
+        </w:rPr>
+        <w:t xml:space="preserve"> this project on </w:t>
+      </w:r>
+      <w:r>
+        <w:rPr>
+          <w:lang w:val="en-US"/>
+        </w:rPr>
+        <w:t>GitHub</w:t>
+      </w:r>
+      <w:r>
+        <w:rPr>
+          <w:lang w:val="en-US"/>
+        </w:rPr>
+        <w:t xml:space="preserve"> Pages this time.</w:t>
       </w:r>
     </w:p>
     <w:p>
@@ -2057,7 +2468,19 @@
           <w:lang w:val="en-US"/>
         </w:rPr>
         <w:lastRenderedPageBreak/>
-        <w:t>I realized I accidentally published the Coursework on Netlify instead on Github Pages. I will publsh this project on github Pages this time.</w:t>
+        <w:t xml:space="preserve">The </w:t>
+      </w:r>
+      <w:r>
+        <w:rPr>
+          <w:lang w:val="en-US"/>
+        </w:rPr>
+        <w:t>GitHub</w:t>
+      </w:r>
+      <w:r>
+        <w:rPr>
+          <w:lang w:val="en-US"/>
+        </w:rPr>
+        <w:t xml:space="preserve"> Pages deployment was very straight forward. I had some issues figuring out the page address as it wasn’t shown with the Published notification.</w:t>
       </w:r>
     </w:p>
     <w:sectPr>
@@ -4543,6 +4966,15 @@
 </file>
 
 <file path=customXml/item2.xml><?xml version="1.0" encoding="utf-8"?>
+<?mso-contentType ?>
+<FormTemplates xmlns="http://schemas.microsoft.com/sharepoint/v3/contenttype/forms">
+  <Display>DocumentLibraryForm</Display>
+  <Edit>DocumentLibraryForm</Edit>
+  <New>DocumentLibraryForm</New>
+</FormTemplates>
+</file>
+
+<file path=customXml/item3.xml><?xml version="1.0" encoding="utf-8"?>
 <ct:contentTypeSchema xmlns:ct="http://schemas.microsoft.com/office/2006/metadata/contentType" xmlns:ma="http://schemas.microsoft.com/office/2006/metadata/properties/metaAttributes" ct:_="" ma:_="" ma:contentTypeName="Asiakirja" ma:contentTypeID="0x01010017418C401CCB2042A3A99A19F43F356D" ma:contentTypeVersion="1" ma:contentTypeDescription="Luo uusi asiakirja." ma:contentTypeScope="" ma:versionID="f4b075d3ca74a5dbaed73e767a156aa0">
   <xsd:schema xmlns:xsd="http://www.w3.org/2001/XMLSchema" xmlns:p="http://schemas.microsoft.com/office/2006/metadata/properties" xmlns:ns1="http://schemas.microsoft.com/sharepoint/v3" targetNamespace="http://schemas.microsoft.com/office/2006/metadata/properties" ma:root="true" ma:fieldsID="4340a008e99365d80b71206bae222996" ns1:_="">
     <xsd:import namespace="http://schemas.microsoft.com/sharepoint/v3"/>
@@ -4608,15 +5040,6 @@
 </ct:contentTypeSchema>
 </file>
 
-<file path=customXml/item3.xml><?xml version="1.0" encoding="utf-8"?>
-<?mso-contentType ?>
-<FormTemplates xmlns="http://schemas.microsoft.com/sharepoint/v3/contenttype/forms">
-  <Display>DocumentLibraryForm</Display>
-  <Edit>DocumentLibraryForm</Edit>
-  <New>DocumentLibraryForm</New>
-</FormTemplates>
-</file>
-
 <file path=customXml/itemProps1.xml><?xml version="1.0" encoding="utf-8"?>
 <ds:datastoreItem xmlns:ds="http://schemas.openxmlformats.org/officeDocument/2006/customXml" ds:itemID="{FA8F0064-303C-446D-896E-46EEB9A79DC3}">
   <ds:schemaRefs>
@@ -4628,6 +5051,14 @@
 </file>
 
 <file path=customXml/itemProps2.xml><?xml version="1.0" encoding="utf-8"?>
+<ds:datastoreItem xmlns:ds="http://schemas.openxmlformats.org/officeDocument/2006/customXml" ds:itemID="{13FBD2FA-5696-460D-A278-9A302A0F72AE}">
+  <ds:schemaRefs>
+    <ds:schemaRef ds:uri="http://schemas.microsoft.com/sharepoint/v3/contenttype/forms"/>
+  </ds:schemaRefs>
+</ds:datastoreItem>
+</file>
+
+<file path=customXml/itemProps3.xml><?xml version="1.0" encoding="utf-8"?>
 <ds:datastoreItem xmlns:ds="http://schemas.openxmlformats.org/officeDocument/2006/customXml" ds:itemID="{B9A87442-5A7B-46FD-BD28-170CE9B7256F}">
   <ds:schemaRefs>
     <ds:schemaRef ds:uri="http://schemas.microsoft.com/office/2006/metadata/contentType"/>
@@ -4642,12 +5073,4 @@
     <ds:schemaRef ds:uri="http://schemas.microsoft.com/office/internal/2005/internalDocumentation"/>
   </ds:schemaRefs>
 </ds:datastoreItem>
-</file>
-
-<file path=customXml/itemProps3.xml><?xml version="1.0" encoding="utf-8"?>
-<ds:datastoreItem xmlns:ds="http://schemas.openxmlformats.org/officeDocument/2006/customXml" ds:itemID="{13FBD2FA-5696-460D-A278-9A302A0F72AE}">
-  <ds:schemaRefs>
-    <ds:schemaRef ds:uri="http://schemas.microsoft.com/sharepoint/v3/contenttype/forms"/>
-  </ds:schemaRefs>
-</ds:datastoreItem>
 </file>
</xml_diff>